<commit_message>
Put labor condition values in assessment card
Co-authored-by: Andrii Korzhov <Sferaved@users.noreply.github.com>
</commit_message>
<xml_diff>
--- a/practical_variant_4/Praktychna_robota_variant_4.docx
+++ b/practical_variant_4/Praktychna_robota_variant_4.docx
@@ -2194,7 +2194,7 @@
           <w:i/>
           <w:sz w:val="24"/>
         </w:rPr>
-        <w:t>Таблиця 1.2 - Узагальнена карта оцінки умов праці</w:t>
+        <w:t>Таблиця 1.2 - Карта оцінки умов праці</w:t>
       </w:r>
     </w:p>
     <w:tbl>
@@ -2212,13 +2212,20 @@
         </w:tblBorders>
       </w:tblPr>
       <w:tblGrid>
-        <w:gridCol w:w="4844"/>
-        <w:gridCol w:w="4844"/>
+        <w:gridCol w:w="1077"/>
+        <w:gridCol w:w="1077"/>
+        <w:gridCol w:w="1077"/>
+        <w:gridCol w:w="1077"/>
+        <w:gridCol w:w="1077"/>
+        <w:gridCol w:w="1077"/>
+        <w:gridCol w:w="1077"/>
+        <w:gridCol w:w="1077"/>
+        <w:gridCol w:w="1077"/>
       </w:tblGrid>
       <w:tr>
         <w:tc>
           <w:tcPr>
-            <w:tcW w:type="dxa" w:w="4844"/>
+            <w:tcW w:type="dxa" w:w="1077"/>
             <w:vAlign w:val="center"/>
             <w:shd w:fill="D9EAF7"/>
           </w:tcPr>
@@ -2226,20 +2233,24 @@
             <w:pPr>
               <w:jc w:val="center"/>
             </w:pPr>
-            <w:r/>
+            <w:r>
+              <w:rPr>
+                <w:sz w:val="18"/>
+              </w:rPr>
+            </w:r>
             <w:r>
               <w:rPr>
                 <w:rFonts w:ascii="Times New Roman" w:hAnsi="Times New Roman"/>
                 <w:b/>
-                <w:sz w:val="22"/>
+                <w:sz w:val="18"/>
               </w:rPr>
-              <w:t>Фактор</w:t>
+              <w:t>Фактор виробничого середовища</w:t>
             </w:r>
           </w:p>
         </w:tc>
         <w:tc>
           <w:tcPr>
-            <w:tcW w:type="dxa" w:w="4844"/>
+            <w:tcW w:type="dxa" w:w="1077"/>
             <w:vAlign w:val="center"/>
             <w:shd w:fill="D9EAF7"/>
           </w:tcPr>
@@ -2247,14 +2258,193 @@
             <w:pPr>
               <w:jc w:val="center"/>
             </w:pPr>
-            <w:r/>
+            <w:r>
+              <w:rPr>
+                <w:sz w:val="18"/>
+              </w:rPr>
+            </w:r>
             <w:r>
               <w:rPr>
                 <w:rFonts w:ascii="Times New Roman" w:hAnsi="Times New Roman"/>
                 <w:b/>
-                <w:sz w:val="22"/>
+                <w:sz w:val="18"/>
               </w:rPr>
-              <w:t>Підсумковий клас</w:t>
+              <w:t>Фактичне значення</w:t>
+            </w:r>
+          </w:p>
+        </w:tc>
+        <w:tc>
+          <w:tcPr>
+            <w:tcW w:type="dxa" w:w="1077"/>
+            <w:vAlign w:val="center"/>
+            <w:shd w:fill="D9EAF7"/>
+          </w:tcPr>
+          <w:p>
+            <w:pPr>
+              <w:jc w:val="center"/>
+            </w:pPr>
+            <w:r>
+              <w:rPr>
+                <w:sz w:val="18"/>
+              </w:rPr>
+            </w:r>
+            <w:r>
+              <w:rPr>
+                <w:rFonts w:ascii="Times New Roman" w:hAnsi="Times New Roman"/>
+                <w:b/>
+                <w:sz w:val="18"/>
+              </w:rPr>
+              <w:t>1</w:t>
+            </w:r>
+          </w:p>
+        </w:tc>
+        <w:tc>
+          <w:tcPr>
+            <w:tcW w:type="dxa" w:w="1077"/>
+            <w:vAlign w:val="center"/>
+            <w:shd w:fill="D9EAF7"/>
+          </w:tcPr>
+          <w:p>
+            <w:pPr>
+              <w:jc w:val="center"/>
+            </w:pPr>
+            <w:r>
+              <w:rPr>
+                <w:sz w:val="18"/>
+              </w:rPr>
+            </w:r>
+            <w:r>
+              <w:rPr>
+                <w:rFonts w:ascii="Times New Roman" w:hAnsi="Times New Roman"/>
+                <w:b/>
+                <w:sz w:val="18"/>
+              </w:rPr>
+              <w:t>2</w:t>
+            </w:r>
+          </w:p>
+        </w:tc>
+        <w:tc>
+          <w:tcPr>
+            <w:tcW w:type="dxa" w:w="1077"/>
+            <w:vAlign w:val="center"/>
+            <w:shd w:fill="D9EAF7"/>
+          </w:tcPr>
+          <w:p>
+            <w:pPr>
+              <w:jc w:val="center"/>
+            </w:pPr>
+            <w:r>
+              <w:rPr>
+                <w:sz w:val="18"/>
+              </w:rPr>
+            </w:r>
+            <w:r>
+              <w:rPr>
+                <w:rFonts w:ascii="Times New Roman" w:hAnsi="Times New Roman"/>
+                <w:b/>
+                <w:sz w:val="18"/>
+              </w:rPr>
+              <w:t>3.1</w:t>
+            </w:r>
+          </w:p>
+        </w:tc>
+        <w:tc>
+          <w:tcPr>
+            <w:tcW w:type="dxa" w:w="1077"/>
+            <w:vAlign w:val="center"/>
+            <w:shd w:fill="D9EAF7"/>
+          </w:tcPr>
+          <w:p>
+            <w:pPr>
+              <w:jc w:val="center"/>
+            </w:pPr>
+            <w:r>
+              <w:rPr>
+                <w:sz w:val="18"/>
+              </w:rPr>
+            </w:r>
+            <w:r>
+              <w:rPr>
+                <w:rFonts w:ascii="Times New Roman" w:hAnsi="Times New Roman"/>
+                <w:b/>
+                <w:sz w:val="18"/>
+              </w:rPr>
+              <w:t>3.2</w:t>
+            </w:r>
+          </w:p>
+        </w:tc>
+        <w:tc>
+          <w:tcPr>
+            <w:tcW w:type="dxa" w:w="1077"/>
+            <w:vAlign w:val="center"/>
+            <w:shd w:fill="D9EAF7"/>
+          </w:tcPr>
+          <w:p>
+            <w:pPr>
+              <w:jc w:val="center"/>
+            </w:pPr>
+            <w:r>
+              <w:rPr>
+                <w:sz w:val="18"/>
+              </w:rPr>
+            </w:r>
+            <w:r>
+              <w:rPr>
+                <w:rFonts w:ascii="Times New Roman" w:hAnsi="Times New Roman"/>
+                <w:b/>
+                <w:sz w:val="18"/>
+              </w:rPr>
+              <w:t>3.3</w:t>
+            </w:r>
+          </w:p>
+        </w:tc>
+        <w:tc>
+          <w:tcPr>
+            <w:tcW w:type="dxa" w:w="1077"/>
+            <w:vAlign w:val="center"/>
+            <w:shd w:fill="D9EAF7"/>
+          </w:tcPr>
+          <w:p>
+            <w:pPr>
+              <w:jc w:val="center"/>
+            </w:pPr>
+            <w:r>
+              <w:rPr>
+                <w:sz w:val="18"/>
+              </w:rPr>
+            </w:r>
+            <w:r>
+              <w:rPr>
+                <w:rFonts w:ascii="Times New Roman" w:hAnsi="Times New Roman"/>
+                <w:b/>
+                <w:sz w:val="18"/>
+              </w:rPr>
+              <w:t>3.4</w:t>
+            </w:r>
+          </w:p>
+        </w:tc>
+        <w:tc>
+          <w:tcPr>
+            <w:tcW w:type="dxa" w:w="1077"/>
+            <w:vAlign w:val="center"/>
+            <w:shd w:fill="D9EAF7"/>
+          </w:tcPr>
+          <w:p>
+            <w:pPr>
+              <w:jc w:val="center"/>
+            </w:pPr>
+            <w:r>
+              <w:rPr>
+                <w:sz w:val="18"/>
+              </w:rPr>
+            </w:r>
+            <w:r>
+              <w:rPr>
+                <w:rFonts w:ascii="Times New Roman" w:hAnsi="Times New Roman"/>
+                <w:b/>
+                <w:sz w:val="18"/>
+              </w:rPr>
+              <w:t>4</w:t>
             </w:r>
           </w:p>
         </w:tc>
@@ -2262,41 +2452,211 @@
       <w:tr>
         <w:tc>
           <w:tcPr>
-            <w:tcW w:type="dxa" w:w="4844"/>
+            <w:tcW w:type="dxa" w:w="1077"/>
             <w:vAlign w:val="center"/>
           </w:tcPr>
           <w:p>
             <w:pPr>
               <w:jc w:val="center"/>
             </w:pPr>
-            <w:r/>
+            <w:r>
+              <w:rPr>
+                <w:sz w:val="18"/>
+              </w:rPr>
+            </w:r>
             <w:r>
               <w:rPr>
                 <w:rFonts w:ascii="Times New Roman" w:hAnsi="Times New Roman"/>
                 <w:b w:val="0"/>
-                <w:sz w:val="22"/>
+                <w:sz w:val="18"/>
               </w:rPr>
-              <w:t>Хімічний фактор</w:t>
+              <w:t>Ангідрид хромовий</w:t>
             </w:r>
           </w:p>
         </w:tc>
         <w:tc>
           <w:tcPr>
-            <w:tcW w:type="dxa" w:w="4844"/>
+            <w:tcW w:type="dxa" w:w="1077"/>
             <w:vAlign w:val="center"/>
           </w:tcPr>
           <w:p>
             <w:pPr>
               <w:jc w:val="center"/>
             </w:pPr>
-            <w:r/>
+            <w:r>
+              <w:rPr>
+                <w:sz w:val="18"/>
+              </w:rPr>
+            </w:r>
             <w:r>
               <w:rPr>
                 <w:rFonts w:ascii="Times New Roman" w:hAnsi="Times New Roman"/>
                 <w:b w:val="0"/>
-                <w:sz w:val="22"/>
+                <w:sz w:val="18"/>
               </w:rPr>
-              <w:t>3.1</w:t>
+              <w:t>0,011 мг/м3</w:t>
+            </w:r>
+          </w:p>
+        </w:tc>
+        <w:tc>
+          <w:tcPr>
+            <w:tcW w:type="dxa" w:w="1077"/>
+            <w:vAlign w:val="center"/>
+          </w:tcPr>
+          <w:p>
+            <w:pPr>
+              <w:jc w:val="center"/>
+            </w:pPr>
+            <w:r>
+              <w:rPr>
+                <w:sz w:val="18"/>
+              </w:rPr>
+            </w:r>
+            <w:r>
+              <w:rPr>
+                <w:rFonts w:ascii="Times New Roman" w:hAnsi="Times New Roman"/>
+                <w:b w:val="0"/>
+                <w:sz w:val="18"/>
+              </w:rPr>
+            </w:r>
+          </w:p>
+        </w:tc>
+        <w:tc>
+          <w:tcPr>
+            <w:tcW w:type="dxa" w:w="1077"/>
+            <w:vAlign w:val="center"/>
+          </w:tcPr>
+          <w:p>
+            <w:pPr>
+              <w:jc w:val="center"/>
+            </w:pPr>
+            <w:r>
+              <w:rPr>
+                <w:sz w:val="18"/>
+              </w:rPr>
+            </w:r>
+            <w:r>
+              <w:rPr>
+                <w:rFonts w:ascii="Times New Roman" w:hAnsi="Times New Roman"/>
+                <w:b w:val="0"/>
+                <w:sz w:val="18"/>
+              </w:rPr>
+            </w:r>
+          </w:p>
+        </w:tc>
+        <w:tc>
+          <w:tcPr>
+            <w:tcW w:type="dxa" w:w="1077"/>
+            <w:vAlign w:val="center"/>
+          </w:tcPr>
+          <w:p>
+            <w:pPr>
+              <w:jc w:val="center"/>
+            </w:pPr>
+            <w:r>
+              <w:rPr>
+                <w:sz w:val="18"/>
+              </w:rPr>
+            </w:r>
+            <w:r>
+              <w:rPr>
+                <w:rFonts w:ascii="Times New Roman" w:hAnsi="Times New Roman"/>
+                <w:b w:val="0"/>
+                <w:sz w:val="18"/>
+              </w:rPr>
+              <w:t>0,011</w:t>
+            </w:r>
+          </w:p>
+        </w:tc>
+        <w:tc>
+          <w:tcPr>
+            <w:tcW w:type="dxa" w:w="1077"/>
+            <w:vAlign w:val="center"/>
+          </w:tcPr>
+          <w:p>
+            <w:pPr>
+              <w:jc w:val="center"/>
+            </w:pPr>
+            <w:r>
+              <w:rPr>
+                <w:sz w:val="18"/>
+              </w:rPr>
+            </w:r>
+            <w:r>
+              <w:rPr>
+                <w:rFonts w:ascii="Times New Roman" w:hAnsi="Times New Roman"/>
+                <w:b w:val="0"/>
+                <w:sz w:val="18"/>
+              </w:rPr>
+            </w:r>
+          </w:p>
+        </w:tc>
+        <w:tc>
+          <w:tcPr>
+            <w:tcW w:type="dxa" w:w="1077"/>
+            <w:vAlign w:val="center"/>
+          </w:tcPr>
+          <w:p>
+            <w:pPr>
+              <w:jc w:val="center"/>
+            </w:pPr>
+            <w:r>
+              <w:rPr>
+                <w:sz w:val="18"/>
+              </w:rPr>
+            </w:r>
+            <w:r>
+              <w:rPr>
+                <w:rFonts w:ascii="Times New Roman" w:hAnsi="Times New Roman"/>
+                <w:b w:val="0"/>
+                <w:sz w:val="18"/>
+              </w:rPr>
+            </w:r>
+          </w:p>
+        </w:tc>
+        <w:tc>
+          <w:tcPr>
+            <w:tcW w:type="dxa" w:w="1077"/>
+            <w:vAlign w:val="center"/>
+          </w:tcPr>
+          <w:p>
+            <w:pPr>
+              <w:jc w:val="center"/>
+            </w:pPr>
+            <w:r>
+              <w:rPr>
+                <w:sz w:val="18"/>
+              </w:rPr>
+            </w:r>
+            <w:r>
+              <w:rPr>
+                <w:rFonts w:ascii="Times New Roman" w:hAnsi="Times New Roman"/>
+                <w:b w:val="0"/>
+                <w:sz w:val="18"/>
+              </w:rPr>
+            </w:r>
+          </w:p>
+        </w:tc>
+        <w:tc>
+          <w:tcPr>
+            <w:tcW w:type="dxa" w:w="1077"/>
+            <w:vAlign w:val="center"/>
+          </w:tcPr>
+          <w:p>
+            <w:pPr>
+              <w:jc w:val="center"/>
+            </w:pPr>
+            <w:r>
+              <w:rPr>
+                <w:sz w:val="18"/>
+              </w:rPr>
+            </w:r>
+            <w:r>
+              <w:rPr>
+                <w:rFonts w:ascii="Times New Roman" w:hAnsi="Times New Roman"/>
+                <w:b w:val="0"/>
+                <w:sz w:val="18"/>
+              </w:rPr>
             </w:r>
           </w:p>
         </w:tc>
@@ -2304,19 +2664,1295 @@
       <w:tr>
         <w:tc>
           <w:tcPr>
-            <w:tcW w:type="dxa" w:w="4844"/>
+            <w:tcW w:type="dxa" w:w="1077"/>
             <w:vAlign w:val="center"/>
           </w:tcPr>
           <w:p>
             <w:pPr>
               <w:jc w:val="center"/>
             </w:pPr>
-            <w:r/>
+            <w:r>
+              <w:rPr>
+                <w:sz w:val="18"/>
+              </w:rPr>
+            </w:r>
             <w:r>
               <w:rPr>
                 <w:rFonts w:ascii="Times New Roman" w:hAnsi="Times New Roman"/>
                 <w:b w:val="0"/>
-                <w:sz w:val="22"/>
+                <w:sz w:val="18"/>
+              </w:rPr>
+              <w:t>Нікель</w:t>
+            </w:r>
+          </w:p>
+        </w:tc>
+        <w:tc>
+          <w:tcPr>
+            <w:tcW w:type="dxa" w:w="1077"/>
+            <w:vAlign w:val="center"/>
+          </w:tcPr>
+          <w:p>
+            <w:pPr>
+              <w:jc w:val="center"/>
+            </w:pPr>
+            <w:r>
+              <w:rPr>
+                <w:sz w:val="18"/>
+              </w:rPr>
+            </w:r>
+            <w:r>
+              <w:rPr>
+                <w:rFonts w:ascii="Times New Roman" w:hAnsi="Times New Roman"/>
+                <w:b w:val="0"/>
+                <w:sz w:val="18"/>
+              </w:rPr>
+              <w:t>0,0089 мг/м3</w:t>
+            </w:r>
+          </w:p>
+        </w:tc>
+        <w:tc>
+          <w:tcPr>
+            <w:tcW w:type="dxa" w:w="1077"/>
+            <w:vAlign w:val="center"/>
+          </w:tcPr>
+          <w:p>
+            <w:pPr>
+              <w:jc w:val="center"/>
+            </w:pPr>
+            <w:r>
+              <w:rPr>
+                <w:sz w:val="18"/>
+              </w:rPr>
+            </w:r>
+            <w:r>
+              <w:rPr>
+                <w:rFonts w:ascii="Times New Roman" w:hAnsi="Times New Roman"/>
+                <w:b w:val="0"/>
+                <w:sz w:val="18"/>
+              </w:rPr>
+            </w:r>
+          </w:p>
+        </w:tc>
+        <w:tc>
+          <w:tcPr>
+            <w:tcW w:type="dxa" w:w="1077"/>
+            <w:vAlign w:val="center"/>
+          </w:tcPr>
+          <w:p>
+            <w:pPr>
+              <w:jc w:val="center"/>
+            </w:pPr>
+            <w:r>
+              <w:rPr>
+                <w:sz w:val="18"/>
+              </w:rPr>
+            </w:r>
+            <w:r>
+              <w:rPr>
+                <w:rFonts w:ascii="Times New Roman" w:hAnsi="Times New Roman"/>
+                <w:b w:val="0"/>
+                <w:sz w:val="18"/>
+              </w:rPr>
+              <w:t>0,0089</w:t>
+            </w:r>
+          </w:p>
+        </w:tc>
+        <w:tc>
+          <w:tcPr>
+            <w:tcW w:type="dxa" w:w="1077"/>
+            <w:vAlign w:val="center"/>
+          </w:tcPr>
+          <w:p>
+            <w:pPr>
+              <w:jc w:val="center"/>
+            </w:pPr>
+            <w:r>
+              <w:rPr>
+                <w:sz w:val="18"/>
+              </w:rPr>
+            </w:r>
+            <w:r>
+              <w:rPr>
+                <w:rFonts w:ascii="Times New Roman" w:hAnsi="Times New Roman"/>
+                <w:b w:val="0"/>
+                <w:sz w:val="18"/>
+              </w:rPr>
+            </w:r>
+          </w:p>
+        </w:tc>
+        <w:tc>
+          <w:tcPr>
+            <w:tcW w:type="dxa" w:w="1077"/>
+            <w:vAlign w:val="center"/>
+          </w:tcPr>
+          <w:p>
+            <w:pPr>
+              <w:jc w:val="center"/>
+            </w:pPr>
+            <w:r>
+              <w:rPr>
+                <w:sz w:val="18"/>
+              </w:rPr>
+            </w:r>
+            <w:r>
+              <w:rPr>
+                <w:rFonts w:ascii="Times New Roman" w:hAnsi="Times New Roman"/>
+                <w:b w:val="0"/>
+                <w:sz w:val="18"/>
+              </w:rPr>
+            </w:r>
+          </w:p>
+        </w:tc>
+        <w:tc>
+          <w:tcPr>
+            <w:tcW w:type="dxa" w:w="1077"/>
+            <w:vAlign w:val="center"/>
+          </w:tcPr>
+          <w:p>
+            <w:pPr>
+              <w:jc w:val="center"/>
+            </w:pPr>
+            <w:r>
+              <w:rPr>
+                <w:sz w:val="18"/>
+              </w:rPr>
+            </w:r>
+            <w:r>
+              <w:rPr>
+                <w:rFonts w:ascii="Times New Roman" w:hAnsi="Times New Roman"/>
+                <w:b w:val="0"/>
+                <w:sz w:val="18"/>
+              </w:rPr>
+            </w:r>
+          </w:p>
+        </w:tc>
+        <w:tc>
+          <w:tcPr>
+            <w:tcW w:type="dxa" w:w="1077"/>
+            <w:vAlign w:val="center"/>
+          </w:tcPr>
+          <w:p>
+            <w:pPr>
+              <w:jc w:val="center"/>
+            </w:pPr>
+            <w:r>
+              <w:rPr>
+                <w:sz w:val="18"/>
+              </w:rPr>
+            </w:r>
+            <w:r>
+              <w:rPr>
+                <w:rFonts w:ascii="Times New Roman" w:hAnsi="Times New Roman"/>
+                <w:b w:val="0"/>
+                <w:sz w:val="18"/>
+              </w:rPr>
+            </w:r>
+          </w:p>
+        </w:tc>
+        <w:tc>
+          <w:tcPr>
+            <w:tcW w:type="dxa" w:w="1077"/>
+            <w:vAlign w:val="center"/>
+          </w:tcPr>
+          <w:p>
+            <w:pPr>
+              <w:jc w:val="center"/>
+            </w:pPr>
+            <w:r>
+              <w:rPr>
+                <w:sz w:val="18"/>
+              </w:rPr>
+            </w:r>
+            <w:r>
+              <w:rPr>
+                <w:rFonts w:ascii="Times New Roman" w:hAnsi="Times New Roman"/>
+                <w:b w:val="0"/>
+                <w:sz w:val="18"/>
+              </w:rPr>
+            </w:r>
+          </w:p>
+        </w:tc>
+      </w:tr>
+      <w:tr>
+        <w:tc>
+          <w:tcPr>
+            <w:tcW w:type="dxa" w:w="1077"/>
+            <w:vAlign w:val="center"/>
+          </w:tcPr>
+          <w:p>
+            <w:pPr>
+              <w:jc w:val="center"/>
+            </w:pPr>
+            <w:r>
+              <w:rPr>
+                <w:sz w:val="18"/>
+              </w:rPr>
+            </w:r>
+            <w:r>
+              <w:rPr>
+                <w:rFonts w:ascii="Times New Roman" w:hAnsi="Times New Roman"/>
+                <w:b w:val="0"/>
+                <w:sz w:val="18"/>
+              </w:rPr>
+              <w:t>Оксиди марганцю</w:t>
+            </w:r>
+          </w:p>
+        </w:tc>
+        <w:tc>
+          <w:tcPr>
+            <w:tcW w:type="dxa" w:w="1077"/>
+            <w:vAlign w:val="center"/>
+          </w:tcPr>
+          <w:p>
+            <w:pPr>
+              <w:jc w:val="center"/>
+            </w:pPr>
+            <w:r>
+              <w:rPr>
+                <w:sz w:val="18"/>
+              </w:rPr>
+            </w:r>
+            <w:r>
+              <w:rPr>
+                <w:rFonts w:ascii="Times New Roman" w:hAnsi="Times New Roman"/>
+                <w:b w:val="0"/>
+                <w:sz w:val="18"/>
+              </w:rPr>
+              <w:t>Не виявл.</w:t>
+            </w:r>
+          </w:p>
+        </w:tc>
+        <w:tc>
+          <w:tcPr>
+            <w:tcW w:type="dxa" w:w="1077"/>
+            <w:vAlign w:val="center"/>
+          </w:tcPr>
+          <w:p>
+            <w:pPr>
+              <w:jc w:val="center"/>
+            </w:pPr>
+            <w:r>
+              <w:rPr>
+                <w:sz w:val="18"/>
+              </w:rPr>
+            </w:r>
+            <w:r>
+              <w:rPr>
+                <w:rFonts w:ascii="Times New Roman" w:hAnsi="Times New Roman"/>
+                <w:b w:val="0"/>
+                <w:sz w:val="18"/>
+              </w:rPr>
+            </w:r>
+          </w:p>
+        </w:tc>
+        <w:tc>
+          <w:tcPr>
+            <w:tcW w:type="dxa" w:w="1077"/>
+            <w:vAlign w:val="center"/>
+          </w:tcPr>
+          <w:p>
+            <w:pPr>
+              <w:jc w:val="center"/>
+            </w:pPr>
+            <w:r>
+              <w:rPr>
+                <w:sz w:val="18"/>
+              </w:rPr>
+            </w:r>
+            <w:r>
+              <w:rPr>
+                <w:rFonts w:ascii="Times New Roman" w:hAnsi="Times New Roman"/>
+                <w:b w:val="0"/>
+                <w:sz w:val="18"/>
+              </w:rPr>
+              <w:t>Не виявл.</w:t>
+            </w:r>
+          </w:p>
+        </w:tc>
+        <w:tc>
+          <w:tcPr>
+            <w:tcW w:type="dxa" w:w="1077"/>
+            <w:vAlign w:val="center"/>
+          </w:tcPr>
+          <w:p>
+            <w:pPr>
+              <w:jc w:val="center"/>
+            </w:pPr>
+            <w:r>
+              <w:rPr>
+                <w:sz w:val="18"/>
+              </w:rPr>
+            </w:r>
+            <w:r>
+              <w:rPr>
+                <w:rFonts w:ascii="Times New Roman" w:hAnsi="Times New Roman"/>
+                <w:b w:val="0"/>
+                <w:sz w:val="18"/>
+              </w:rPr>
+            </w:r>
+          </w:p>
+        </w:tc>
+        <w:tc>
+          <w:tcPr>
+            <w:tcW w:type="dxa" w:w="1077"/>
+            <w:vAlign w:val="center"/>
+          </w:tcPr>
+          <w:p>
+            <w:pPr>
+              <w:jc w:val="center"/>
+            </w:pPr>
+            <w:r>
+              <w:rPr>
+                <w:sz w:val="18"/>
+              </w:rPr>
+            </w:r>
+            <w:r>
+              <w:rPr>
+                <w:rFonts w:ascii="Times New Roman" w:hAnsi="Times New Roman"/>
+                <w:b w:val="0"/>
+                <w:sz w:val="18"/>
+              </w:rPr>
+            </w:r>
+          </w:p>
+        </w:tc>
+        <w:tc>
+          <w:tcPr>
+            <w:tcW w:type="dxa" w:w="1077"/>
+            <w:vAlign w:val="center"/>
+          </w:tcPr>
+          <w:p>
+            <w:pPr>
+              <w:jc w:val="center"/>
+            </w:pPr>
+            <w:r>
+              <w:rPr>
+                <w:sz w:val="18"/>
+              </w:rPr>
+            </w:r>
+            <w:r>
+              <w:rPr>
+                <w:rFonts w:ascii="Times New Roman" w:hAnsi="Times New Roman"/>
+                <w:b w:val="0"/>
+                <w:sz w:val="18"/>
+              </w:rPr>
+            </w:r>
+          </w:p>
+        </w:tc>
+        <w:tc>
+          <w:tcPr>
+            <w:tcW w:type="dxa" w:w="1077"/>
+            <w:vAlign w:val="center"/>
+          </w:tcPr>
+          <w:p>
+            <w:pPr>
+              <w:jc w:val="center"/>
+            </w:pPr>
+            <w:r>
+              <w:rPr>
+                <w:sz w:val="18"/>
+              </w:rPr>
+            </w:r>
+            <w:r>
+              <w:rPr>
+                <w:rFonts w:ascii="Times New Roman" w:hAnsi="Times New Roman"/>
+                <w:b w:val="0"/>
+                <w:sz w:val="18"/>
+              </w:rPr>
+            </w:r>
+          </w:p>
+        </w:tc>
+        <w:tc>
+          <w:tcPr>
+            <w:tcW w:type="dxa" w:w="1077"/>
+            <w:vAlign w:val="center"/>
+          </w:tcPr>
+          <w:p>
+            <w:pPr>
+              <w:jc w:val="center"/>
+            </w:pPr>
+            <w:r>
+              <w:rPr>
+                <w:sz w:val="18"/>
+              </w:rPr>
+            </w:r>
+            <w:r>
+              <w:rPr>
+                <w:rFonts w:ascii="Times New Roman" w:hAnsi="Times New Roman"/>
+                <w:b w:val="0"/>
+                <w:sz w:val="18"/>
+              </w:rPr>
+            </w:r>
+          </w:p>
+        </w:tc>
+      </w:tr>
+      <w:tr>
+        <w:tc>
+          <w:tcPr>
+            <w:tcW w:type="dxa" w:w="1077"/>
+            <w:vAlign w:val="center"/>
+          </w:tcPr>
+          <w:p>
+            <w:pPr>
+              <w:jc w:val="center"/>
+            </w:pPr>
+            <w:r>
+              <w:rPr>
+                <w:sz w:val="18"/>
+              </w:rPr>
+            </w:r>
+            <w:r>
+              <w:rPr>
+                <w:rFonts w:ascii="Times New Roman" w:hAnsi="Times New Roman"/>
+                <w:b w:val="0"/>
+                <w:sz w:val="18"/>
+              </w:rPr>
+              <w:t>Карбід кремнію</w:t>
+            </w:r>
+          </w:p>
+        </w:tc>
+        <w:tc>
+          <w:tcPr>
+            <w:tcW w:type="dxa" w:w="1077"/>
+            <w:vAlign w:val="center"/>
+          </w:tcPr>
+          <w:p>
+            <w:pPr>
+              <w:jc w:val="center"/>
+            </w:pPr>
+            <w:r>
+              <w:rPr>
+                <w:sz w:val="18"/>
+              </w:rPr>
+            </w:r>
+            <w:r>
+              <w:rPr>
+                <w:rFonts w:ascii="Times New Roman" w:hAnsi="Times New Roman"/>
+                <w:b w:val="0"/>
+                <w:sz w:val="18"/>
+              </w:rPr>
+              <w:t>9,28 мг/м3</w:t>
+            </w:r>
+          </w:p>
+        </w:tc>
+        <w:tc>
+          <w:tcPr>
+            <w:tcW w:type="dxa" w:w="1077"/>
+            <w:vAlign w:val="center"/>
+          </w:tcPr>
+          <w:p>
+            <w:pPr>
+              <w:jc w:val="center"/>
+            </w:pPr>
+            <w:r>
+              <w:rPr>
+                <w:sz w:val="18"/>
+              </w:rPr>
+            </w:r>
+            <w:r>
+              <w:rPr>
+                <w:rFonts w:ascii="Times New Roman" w:hAnsi="Times New Roman"/>
+                <w:b w:val="0"/>
+                <w:sz w:val="18"/>
+              </w:rPr>
+            </w:r>
+          </w:p>
+        </w:tc>
+        <w:tc>
+          <w:tcPr>
+            <w:tcW w:type="dxa" w:w="1077"/>
+            <w:vAlign w:val="center"/>
+          </w:tcPr>
+          <w:p>
+            <w:pPr>
+              <w:jc w:val="center"/>
+            </w:pPr>
+            <w:r>
+              <w:rPr>
+                <w:sz w:val="18"/>
+              </w:rPr>
+            </w:r>
+            <w:r>
+              <w:rPr>
+                <w:rFonts w:ascii="Times New Roman" w:hAnsi="Times New Roman"/>
+                <w:b w:val="0"/>
+                <w:sz w:val="18"/>
+              </w:rPr>
+            </w:r>
+          </w:p>
+        </w:tc>
+        <w:tc>
+          <w:tcPr>
+            <w:tcW w:type="dxa" w:w="1077"/>
+            <w:vAlign w:val="center"/>
+          </w:tcPr>
+          <w:p>
+            <w:pPr>
+              <w:jc w:val="center"/>
+            </w:pPr>
+            <w:r>
+              <w:rPr>
+                <w:sz w:val="18"/>
+              </w:rPr>
+            </w:r>
+            <w:r>
+              <w:rPr>
+                <w:rFonts w:ascii="Times New Roman" w:hAnsi="Times New Roman"/>
+                <w:b w:val="0"/>
+                <w:sz w:val="18"/>
+              </w:rPr>
+              <w:t>9,28</w:t>
+            </w:r>
+          </w:p>
+        </w:tc>
+        <w:tc>
+          <w:tcPr>
+            <w:tcW w:type="dxa" w:w="1077"/>
+            <w:vAlign w:val="center"/>
+          </w:tcPr>
+          <w:p>
+            <w:pPr>
+              <w:jc w:val="center"/>
+            </w:pPr>
+            <w:r>
+              <w:rPr>
+                <w:sz w:val="18"/>
+              </w:rPr>
+            </w:r>
+            <w:r>
+              <w:rPr>
+                <w:rFonts w:ascii="Times New Roman" w:hAnsi="Times New Roman"/>
+                <w:b w:val="0"/>
+                <w:sz w:val="18"/>
+              </w:rPr>
+            </w:r>
+          </w:p>
+        </w:tc>
+        <w:tc>
+          <w:tcPr>
+            <w:tcW w:type="dxa" w:w="1077"/>
+            <w:vAlign w:val="center"/>
+          </w:tcPr>
+          <w:p>
+            <w:pPr>
+              <w:jc w:val="center"/>
+            </w:pPr>
+            <w:r>
+              <w:rPr>
+                <w:sz w:val="18"/>
+              </w:rPr>
+            </w:r>
+            <w:r>
+              <w:rPr>
+                <w:rFonts w:ascii="Times New Roman" w:hAnsi="Times New Roman"/>
+                <w:b w:val="0"/>
+                <w:sz w:val="18"/>
+              </w:rPr>
+            </w:r>
+          </w:p>
+        </w:tc>
+        <w:tc>
+          <w:tcPr>
+            <w:tcW w:type="dxa" w:w="1077"/>
+            <w:vAlign w:val="center"/>
+          </w:tcPr>
+          <w:p>
+            <w:pPr>
+              <w:jc w:val="center"/>
+            </w:pPr>
+            <w:r>
+              <w:rPr>
+                <w:sz w:val="18"/>
+              </w:rPr>
+            </w:r>
+            <w:r>
+              <w:rPr>
+                <w:rFonts w:ascii="Times New Roman" w:hAnsi="Times New Roman"/>
+                <w:b w:val="0"/>
+                <w:sz w:val="18"/>
+              </w:rPr>
+            </w:r>
+          </w:p>
+        </w:tc>
+        <w:tc>
+          <w:tcPr>
+            <w:tcW w:type="dxa" w:w="1077"/>
+            <w:vAlign w:val="center"/>
+          </w:tcPr>
+          <w:p>
+            <w:pPr>
+              <w:jc w:val="center"/>
+            </w:pPr>
+            <w:r>
+              <w:rPr>
+                <w:sz w:val="18"/>
+              </w:rPr>
+            </w:r>
+            <w:r>
+              <w:rPr>
+                <w:rFonts w:ascii="Times New Roman" w:hAnsi="Times New Roman"/>
+                <w:b w:val="0"/>
+                <w:sz w:val="18"/>
+              </w:rPr>
+            </w:r>
+          </w:p>
+        </w:tc>
+      </w:tr>
+      <w:tr>
+        <w:tc>
+          <w:tcPr>
+            <w:tcW w:type="dxa" w:w="1077"/>
+            <w:vAlign w:val="center"/>
+          </w:tcPr>
+          <w:p>
+            <w:pPr>
+              <w:jc w:val="center"/>
+            </w:pPr>
+            <w:r>
+              <w:rPr>
+                <w:sz w:val="18"/>
+              </w:rPr>
+            </w:r>
+            <w:r>
+              <w:rPr>
+                <w:rFonts w:ascii="Times New Roman" w:hAnsi="Times New Roman"/>
+                <w:b w:val="0"/>
+                <w:sz w:val="18"/>
+              </w:rPr>
+              <w:t>Оксид залізу</w:t>
+            </w:r>
+          </w:p>
+        </w:tc>
+        <w:tc>
+          <w:tcPr>
+            <w:tcW w:type="dxa" w:w="1077"/>
+            <w:vAlign w:val="center"/>
+          </w:tcPr>
+          <w:p>
+            <w:pPr>
+              <w:jc w:val="center"/>
+            </w:pPr>
+            <w:r>
+              <w:rPr>
+                <w:sz w:val="18"/>
+              </w:rPr>
+            </w:r>
+            <w:r>
+              <w:rPr>
+                <w:rFonts w:ascii="Times New Roman" w:hAnsi="Times New Roman"/>
+                <w:b w:val="0"/>
+                <w:sz w:val="18"/>
+              </w:rPr>
+              <w:t>Не виявл.</w:t>
+            </w:r>
+          </w:p>
+        </w:tc>
+        <w:tc>
+          <w:tcPr>
+            <w:tcW w:type="dxa" w:w="1077"/>
+            <w:vAlign w:val="center"/>
+          </w:tcPr>
+          <w:p>
+            <w:pPr>
+              <w:jc w:val="center"/>
+            </w:pPr>
+            <w:r>
+              <w:rPr>
+                <w:sz w:val="18"/>
+              </w:rPr>
+            </w:r>
+            <w:r>
+              <w:rPr>
+                <w:rFonts w:ascii="Times New Roman" w:hAnsi="Times New Roman"/>
+                <w:b w:val="0"/>
+                <w:sz w:val="18"/>
+              </w:rPr>
+            </w:r>
+          </w:p>
+        </w:tc>
+        <w:tc>
+          <w:tcPr>
+            <w:tcW w:type="dxa" w:w="1077"/>
+            <w:vAlign w:val="center"/>
+          </w:tcPr>
+          <w:p>
+            <w:pPr>
+              <w:jc w:val="center"/>
+            </w:pPr>
+            <w:r>
+              <w:rPr>
+                <w:sz w:val="18"/>
+              </w:rPr>
+            </w:r>
+            <w:r>
+              <w:rPr>
+                <w:rFonts w:ascii="Times New Roman" w:hAnsi="Times New Roman"/>
+                <w:b w:val="0"/>
+                <w:sz w:val="18"/>
+              </w:rPr>
+              <w:t>Не виявл.</w:t>
+            </w:r>
+          </w:p>
+        </w:tc>
+        <w:tc>
+          <w:tcPr>
+            <w:tcW w:type="dxa" w:w="1077"/>
+            <w:vAlign w:val="center"/>
+          </w:tcPr>
+          <w:p>
+            <w:pPr>
+              <w:jc w:val="center"/>
+            </w:pPr>
+            <w:r>
+              <w:rPr>
+                <w:sz w:val="18"/>
+              </w:rPr>
+            </w:r>
+            <w:r>
+              <w:rPr>
+                <w:rFonts w:ascii="Times New Roman" w:hAnsi="Times New Roman"/>
+                <w:b w:val="0"/>
+                <w:sz w:val="18"/>
+              </w:rPr>
+            </w:r>
+          </w:p>
+        </w:tc>
+        <w:tc>
+          <w:tcPr>
+            <w:tcW w:type="dxa" w:w="1077"/>
+            <w:vAlign w:val="center"/>
+          </w:tcPr>
+          <w:p>
+            <w:pPr>
+              <w:jc w:val="center"/>
+            </w:pPr>
+            <w:r>
+              <w:rPr>
+                <w:sz w:val="18"/>
+              </w:rPr>
+            </w:r>
+            <w:r>
+              <w:rPr>
+                <w:rFonts w:ascii="Times New Roman" w:hAnsi="Times New Roman"/>
+                <w:b w:val="0"/>
+                <w:sz w:val="18"/>
+              </w:rPr>
+            </w:r>
+          </w:p>
+        </w:tc>
+        <w:tc>
+          <w:tcPr>
+            <w:tcW w:type="dxa" w:w="1077"/>
+            <w:vAlign w:val="center"/>
+          </w:tcPr>
+          <w:p>
+            <w:pPr>
+              <w:jc w:val="center"/>
+            </w:pPr>
+            <w:r>
+              <w:rPr>
+                <w:sz w:val="18"/>
+              </w:rPr>
+            </w:r>
+            <w:r>
+              <w:rPr>
+                <w:rFonts w:ascii="Times New Roman" w:hAnsi="Times New Roman"/>
+                <w:b w:val="0"/>
+                <w:sz w:val="18"/>
+              </w:rPr>
+            </w:r>
+          </w:p>
+        </w:tc>
+        <w:tc>
+          <w:tcPr>
+            <w:tcW w:type="dxa" w:w="1077"/>
+            <w:vAlign w:val="center"/>
+          </w:tcPr>
+          <w:p>
+            <w:pPr>
+              <w:jc w:val="center"/>
+            </w:pPr>
+            <w:r>
+              <w:rPr>
+                <w:sz w:val="18"/>
+              </w:rPr>
+            </w:r>
+            <w:r>
+              <w:rPr>
+                <w:rFonts w:ascii="Times New Roman" w:hAnsi="Times New Roman"/>
+                <w:b w:val="0"/>
+                <w:sz w:val="18"/>
+              </w:rPr>
+            </w:r>
+          </w:p>
+        </w:tc>
+        <w:tc>
+          <w:tcPr>
+            <w:tcW w:type="dxa" w:w="1077"/>
+            <w:vAlign w:val="center"/>
+          </w:tcPr>
+          <w:p>
+            <w:pPr>
+              <w:jc w:val="center"/>
+            </w:pPr>
+            <w:r>
+              <w:rPr>
+                <w:sz w:val="18"/>
+              </w:rPr>
+            </w:r>
+            <w:r>
+              <w:rPr>
+                <w:rFonts w:ascii="Times New Roman" w:hAnsi="Times New Roman"/>
+                <w:b w:val="0"/>
+                <w:sz w:val="18"/>
+              </w:rPr>
+            </w:r>
+          </w:p>
+        </w:tc>
+      </w:tr>
+      <w:tr>
+        <w:tc>
+          <w:tcPr>
+            <w:tcW w:type="dxa" w:w="1077"/>
+            <w:vAlign w:val="center"/>
+          </w:tcPr>
+          <w:p>
+            <w:pPr>
+              <w:jc w:val="center"/>
+            </w:pPr>
+            <w:r>
+              <w:rPr>
+                <w:sz w:val="18"/>
+              </w:rPr>
+            </w:r>
+            <w:r>
+              <w:rPr>
+                <w:rFonts w:ascii="Times New Roman" w:hAnsi="Times New Roman"/>
+                <w:b w:val="0"/>
+                <w:sz w:val="18"/>
+              </w:rPr>
+              <w:t>Вольфраму карбід</w:t>
+            </w:r>
+          </w:p>
+        </w:tc>
+        <w:tc>
+          <w:tcPr>
+            <w:tcW w:type="dxa" w:w="1077"/>
+            <w:vAlign w:val="center"/>
+          </w:tcPr>
+          <w:p>
+            <w:pPr>
+              <w:jc w:val="center"/>
+            </w:pPr>
+            <w:r>
+              <w:rPr>
+                <w:sz w:val="18"/>
+              </w:rPr>
+            </w:r>
+            <w:r>
+              <w:rPr>
+                <w:rFonts w:ascii="Times New Roman" w:hAnsi="Times New Roman"/>
+                <w:b w:val="0"/>
+                <w:sz w:val="18"/>
+              </w:rPr>
+              <w:t>5,36 мг/м3</w:t>
+            </w:r>
+          </w:p>
+        </w:tc>
+        <w:tc>
+          <w:tcPr>
+            <w:tcW w:type="dxa" w:w="1077"/>
+            <w:vAlign w:val="center"/>
+          </w:tcPr>
+          <w:p>
+            <w:pPr>
+              <w:jc w:val="center"/>
+            </w:pPr>
+            <w:r>
+              <w:rPr>
+                <w:sz w:val="18"/>
+              </w:rPr>
+            </w:r>
+            <w:r>
+              <w:rPr>
+                <w:rFonts w:ascii="Times New Roman" w:hAnsi="Times New Roman"/>
+                <w:b w:val="0"/>
+                <w:sz w:val="18"/>
+              </w:rPr>
+            </w:r>
+          </w:p>
+        </w:tc>
+        <w:tc>
+          <w:tcPr>
+            <w:tcW w:type="dxa" w:w="1077"/>
+            <w:vAlign w:val="center"/>
+          </w:tcPr>
+          <w:p>
+            <w:pPr>
+              <w:jc w:val="center"/>
+            </w:pPr>
+            <w:r>
+              <w:rPr>
+                <w:sz w:val="18"/>
+              </w:rPr>
+            </w:r>
+            <w:r>
+              <w:rPr>
+                <w:rFonts w:ascii="Times New Roman" w:hAnsi="Times New Roman"/>
+                <w:b w:val="0"/>
+                <w:sz w:val="18"/>
+              </w:rPr>
+              <w:t>5,36</w:t>
+            </w:r>
+          </w:p>
+        </w:tc>
+        <w:tc>
+          <w:tcPr>
+            <w:tcW w:type="dxa" w:w="1077"/>
+            <w:vAlign w:val="center"/>
+          </w:tcPr>
+          <w:p>
+            <w:pPr>
+              <w:jc w:val="center"/>
+            </w:pPr>
+            <w:r>
+              <w:rPr>
+                <w:sz w:val="18"/>
+              </w:rPr>
+            </w:r>
+            <w:r>
+              <w:rPr>
+                <w:rFonts w:ascii="Times New Roman" w:hAnsi="Times New Roman"/>
+                <w:b w:val="0"/>
+                <w:sz w:val="18"/>
+              </w:rPr>
+            </w:r>
+          </w:p>
+        </w:tc>
+        <w:tc>
+          <w:tcPr>
+            <w:tcW w:type="dxa" w:w="1077"/>
+            <w:vAlign w:val="center"/>
+          </w:tcPr>
+          <w:p>
+            <w:pPr>
+              <w:jc w:val="center"/>
+            </w:pPr>
+            <w:r>
+              <w:rPr>
+                <w:sz w:val="18"/>
+              </w:rPr>
+            </w:r>
+            <w:r>
+              <w:rPr>
+                <w:rFonts w:ascii="Times New Roman" w:hAnsi="Times New Roman"/>
+                <w:b w:val="0"/>
+                <w:sz w:val="18"/>
+              </w:rPr>
+            </w:r>
+          </w:p>
+        </w:tc>
+        <w:tc>
+          <w:tcPr>
+            <w:tcW w:type="dxa" w:w="1077"/>
+            <w:vAlign w:val="center"/>
+          </w:tcPr>
+          <w:p>
+            <w:pPr>
+              <w:jc w:val="center"/>
+            </w:pPr>
+            <w:r>
+              <w:rPr>
+                <w:sz w:val="18"/>
+              </w:rPr>
+            </w:r>
+            <w:r>
+              <w:rPr>
+                <w:rFonts w:ascii="Times New Roman" w:hAnsi="Times New Roman"/>
+                <w:b w:val="0"/>
+                <w:sz w:val="18"/>
+              </w:rPr>
+            </w:r>
+          </w:p>
+        </w:tc>
+        <w:tc>
+          <w:tcPr>
+            <w:tcW w:type="dxa" w:w="1077"/>
+            <w:vAlign w:val="center"/>
+          </w:tcPr>
+          <w:p>
+            <w:pPr>
+              <w:jc w:val="center"/>
+            </w:pPr>
+            <w:r>
+              <w:rPr>
+                <w:sz w:val="18"/>
+              </w:rPr>
+            </w:r>
+            <w:r>
+              <w:rPr>
+                <w:rFonts w:ascii="Times New Roman" w:hAnsi="Times New Roman"/>
+                <w:b w:val="0"/>
+                <w:sz w:val="18"/>
+              </w:rPr>
+            </w:r>
+          </w:p>
+        </w:tc>
+        <w:tc>
+          <w:tcPr>
+            <w:tcW w:type="dxa" w:w="1077"/>
+            <w:vAlign w:val="center"/>
+          </w:tcPr>
+          <w:p>
+            <w:pPr>
+              <w:jc w:val="center"/>
+            </w:pPr>
+            <w:r>
+              <w:rPr>
+                <w:sz w:val="18"/>
+              </w:rPr>
+            </w:r>
+            <w:r>
+              <w:rPr>
+                <w:rFonts w:ascii="Times New Roman" w:hAnsi="Times New Roman"/>
+                <w:b w:val="0"/>
+                <w:sz w:val="18"/>
+              </w:rPr>
+            </w:r>
+          </w:p>
+        </w:tc>
+      </w:tr>
+      <w:tr>
+        <w:tc>
+          <w:tcPr>
+            <w:tcW w:type="dxa" w:w="1077"/>
+            <w:vAlign w:val="center"/>
+          </w:tcPr>
+          <w:p>
+            <w:pPr>
+              <w:jc w:val="center"/>
+            </w:pPr>
+            <w:r>
+              <w:rPr>
+                <w:sz w:val="18"/>
+              </w:rPr>
+            </w:r>
+            <w:r>
+              <w:rPr>
+                <w:rFonts w:ascii="Times New Roman" w:hAnsi="Times New Roman"/>
+                <w:b w:val="0"/>
+                <w:sz w:val="18"/>
+              </w:rPr>
+              <w:t>Оксид титану</w:t>
+            </w:r>
+          </w:p>
+        </w:tc>
+        <w:tc>
+          <w:tcPr>
+            <w:tcW w:type="dxa" w:w="1077"/>
+            <w:vAlign w:val="center"/>
+          </w:tcPr>
+          <w:p>
+            <w:pPr>
+              <w:jc w:val="center"/>
+            </w:pPr>
+            <w:r>
+              <w:rPr>
+                <w:sz w:val="18"/>
+              </w:rPr>
+            </w:r>
+            <w:r>
+              <w:rPr>
+                <w:rFonts w:ascii="Times New Roman" w:hAnsi="Times New Roman"/>
+                <w:b w:val="0"/>
+                <w:sz w:val="18"/>
+              </w:rPr>
+              <w:t>12,25 мг/м3</w:t>
+            </w:r>
+          </w:p>
+        </w:tc>
+        <w:tc>
+          <w:tcPr>
+            <w:tcW w:type="dxa" w:w="1077"/>
+            <w:vAlign w:val="center"/>
+          </w:tcPr>
+          <w:p>
+            <w:pPr>
+              <w:jc w:val="center"/>
+            </w:pPr>
+            <w:r>
+              <w:rPr>
+                <w:sz w:val="18"/>
+              </w:rPr>
+            </w:r>
+            <w:r>
+              <w:rPr>
+                <w:rFonts w:ascii="Times New Roman" w:hAnsi="Times New Roman"/>
+                <w:b w:val="0"/>
+                <w:sz w:val="18"/>
+              </w:rPr>
+            </w:r>
+          </w:p>
+        </w:tc>
+        <w:tc>
+          <w:tcPr>
+            <w:tcW w:type="dxa" w:w="1077"/>
+            <w:vAlign w:val="center"/>
+          </w:tcPr>
+          <w:p>
+            <w:pPr>
+              <w:jc w:val="center"/>
+            </w:pPr>
+            <w:r>
+              <w:rPr>
+                <w:sz w:val="18"/>
+              </w:rPr>
+            </w:r>
+            <w:r>
+              <w:rPr>
+                <w:rFonts w:ascii="Times New Roman" w:hAnsi="Times New Roman"/>
+                <w:b w:val="0"/>
+                <w:sz w:val="18"/>
+              </w:rPr>
+            </w:r>
+          </w:p>
+        </w:tc>
+        <w:tc>
+          <w:tcPr>
+            <w:tcW w:type="dxa" w:w="1077"/>
+            <w:vAlign w:val="center"/>
+          </w:tcPr>
+          <w:p>
+            <w:pPr>
+              <w:jc w:val="center"/>
+            </w:pPr>
+            <w:r>
+              <w:rPr>
+                <w:sz w:val="18"/>
+              </w:rPr>
+            </w:r>
+            <w:r>
+              <w:rPr>
+                <w:rFonts w:ascii="Times New Roman" w:hAnsi="Times New Roman"/>
+                <w:b w:val="0"/>
+                <w:sz w:val="18"/>
+              </w:rPr>
+              <w:t>12,25</w:t>
+            </w:r>
+          </w:p>
+        </w:tc>
+        <w:tc>
+          <w:tcPr>
+            <w:tcW w:type="dxa" w:w="1077"/>
+            <w:vAlign w:val="center"/>
+          </w:tcPr>
+          <w:p>
+            <w:pPr>
+              <w:jc w:val="center"/>
+            </w:pPr>
+            <w:r>
+              <w:rPr>
+                <w:sz w:val="18"/>
+              </w:rPr>
+            </w:r>
+            <w:r>
+              <w:rPr>
+                <w:rFonts w:ascii="Times New Roman" w:hAnsi="Times New Roman"/>
+                <w:b w:val="0"/>
+                <w:sz w:val="18"/>
+              </w:rPr>
+            </w:r>
+          </w:p>
+        </w:tc>
+        <w:tc>
+          <w:tcPr>
+            <w:tcW w:type="dxa" w:w="1077"/>
+            <w:vAlign w:val="center"/>
+          </w:tcPr>
+          <w:p>
+            <w:pPr>
+              <w:jc w:val="center"/>
+            </w:pPr>
+            <w:r>
+              <w:rPr>
+                <w:sz w:val="18"/>
+              </w:rPr>
+            </w:r>
+            <w:r>
+              <w:rPr>
+                <w:rFonts w:ascii="Times New Roman" w:hAnsi="Times New Roman"/>
+                <w:b w:val="0"/>
+                <w:sz w:val="18"/>
+              </w:rPr>
+            </w:r>
+          </w:p>
+        </w:tc>
+        <w:tc>
+          <w:tcPr>
+            <w:tcW w:type="dxa" w:w="1077"/>
+            <w:vAlign w:val="center"/>
+          </w:tcPr>
+          <w:p>
+            <w:pPr>
+              <w:jc w:val="center"/>
+            </w:pPr>
+            <w:r>
+              <w:rPr>
+                <w:sz w:val="18"/>
+              </w:rPr>
+            </w:r>
+            <w:r>
+              <w:rPr>
+                <w:rFonts w:ascii="Times New Roman" w:hAnsi="Times New Roman"/>
+                <w:b w:val="0"/>
+                <w:sz w:val="18"/>
+              </w:rPr>
+            </w:r>
+          </w:p>
+        </w:tc>
+        <w:tc>
+          <w:tcPr>
+            <w:tcW w:type="dxa" w:w="1077"/>
+            <w:vAlign w:val="center"/>
+          </w:tcPr>
+          <w:p>
+            <w:pPr>
+              <w:jc w:val="center"/>
+            </w:pPr>
+            <w:r>
+              <w:rPr>
+                <w:sz w:val="18"/>
+              </w:rPr>
+            </w:r>
+            <w:r>
+              <w:rPr>
+                <w:rFonts w:ascii="Times New Roman" w:hAnsi="Times New Roman"/>
+                <w:b w:val="0"/>
+                <w:sz w:val="18"/>
+              </w:rPr>
+            </w:r>
+          </w:p>
+        </w:tc>
+      </w:tr>
+      <w:tr>
+        <w:tc>
+          <w:tcPr>
+            <w:tcW w:type="dxa" w:w="1077"/>
+            <w:vAlign w:val="center"/>
+          </w:tcPr>
+          <w:p>
+            <w:pPr>
+              <w:jc w:val="center"/>
+            </w:pPr>
+            <w:r>
+              <w:rPr>
+                <w:sz w:val="18"/>
+              </w:rPr>
+            </w:r>
+            <w:r>
+              <w:rPr>
+                <w:rFonts w:ascii="Times New Roman" w:hAnsi="Times New Roman"/>
+                <w:b w:val="0"/>
+                <w:sz w:val="18"/>
               </w:rPr>
               <w:t>Шум</w:t>
             </w:r>
@@ -2324,21 +3960,187 @@
         </w:tc>
         <w:tc>
           <w:tcPr>
-            <w:tcW w:type="dxa" w:w="4844"/>
+            <w:tcW w:type="dxa" w:w="1077"/>
             <w:vAlign w:val="center"/>
           </w:tcPr>
           <w:p>
             <w:pPr>
               <w:jc w:val="center"/>
             </w:pPr>
-            <w:r/>
+            <w:r>
+              <w:rPr>
+                <w:sz w:val="18"/>
+              </w:rPr>
+            </w:r>
             <w:r>
               <w:rPr>
                 <w:rFonts w:ascii="Times New Roman" w:hAnsi="Times New Roman"/>
                 <w:b w:val="0"/>
-                <w:sz w:val="22"/>
+                <w:sz w:val="18"/>
               </w:rPr>
-              <w:t>3.2</w:t>
+              <w:t>87 дБА</w:t>
+            </w:r>
+          </w:p>
+        </w:tc>
+        <w:tc>
+          <w:tcPr>
+            <w:tcW w:type="dxa" w:w="1077"/>
+            <w:vAlign w:val="center"/>
+          </w:tcPr>
+          <w:p>
+            <w:pPr>
+              <w:jc w:val="center"/>
+            </w:pPr>
+            <w:r>
+              <w:rPr>
+                <w:sz w:val="18"/>
+              </w:rPr>
+            </w:r>
+            <w:r>
+              <w:rPr>
+                <w:rFonts w:ascii="Times New Roman" w:hAnsi="Times New Roman"/>
+                <w:b w:val="0"/>
+                <w:sz w:val="18"/>
+              </w:rPr>
+            </w:r>
+          </w:p>
+        </w:tc>
+        <w:tc>
+          <w:tcPr>
+            <w:tcW w:type="dxa" w:w="1077"/>
+            <w:vAlign w:val="center"/>
+          </w:tcPr>
+          <w:p>
+            <w:pPr>
+              <w:jc w:val="center"/>
+            </w:pPr>
+            <w:r>
+              <w:rPr>
+                <w:sz w:val="18"/>
+              </w:rPr>
+            </w:r>
+            <w:r>
+              <w:rPr>
+                <w:rFonts w:ascii="Times New Roman" w:hAnsi="Times New Roman"/>
+                <w:b w:val="0"/>
+                <w:sz w:val="18"/>
+              </w:rPr>
+            </w:r>
+          </w:p>
+        </w:tc>
+        <w:tc>
+          <w:tcPr>
+            <w:tcW w:type="dxa" w:w="1077"/>
+            <w:vAlign w:val="center"/>
+          </w:tcPr>
+          <w:p>
+            <w:pPr>
+              <w:jc w:val="center"/>
+            </w:pPr>
+            <w:r>
+              <w:rPr>
+                <w:sz w:val="18"/>
+              </w:rPr>
+            </w:r>
+            <w:r>
+              <w:rPr>
+                <w:rFonts w:ascii="Times New Roman" w:hAnsi="Times New Roman"/>
+                <w:b w:val="0"/>
+                <w:sz w:val="18"/>
+              </w:rPr>
+            </w:r>
+          </w:p>
+        </w:tc>
+        <w:tc>
+          <w:tcPr>
+            <w:tcW w:type="dxa" w:w="1077"/>
+            <w:vAlign w:val="center"/>
+          </w:tcPr>
+          <w:p>
+            <w:pPr>
+              <w:jc w:val="center"/>
+            </w:pPr>
+            <w:r>
+              <w:rPr>
+                <w:sz w:val="18"/>
+              </w:rPr>
+            </w:r>
+            <w:r>
+              <w:rPr>
+                <w:rFonts w:ascii="Times New Roman" w:hAnsi="Times New Roman"/>
+                <w:b w:val="0"/>
+                <w:sz w:val="18"/>
+              </w:rPr>
+              <w:t>87</w:t>
+            </w:r>
+          </w:p>
+        </w:tc>
+        <w:tc>
+          <w:tcPr>
+            <w:tcW w:type="dxa" w:w="1077"/>
+            <w:vAlign w:val="center"/>
+          </w:tcPr>
+          <w:p>
+            <w:pPr>
+              <w:jc w:val="center"/>
+            </w:pPr>
+            <w:r>
+              <w:rPr>
+                <w:sz w:val="18"/>
+              </w:rPr>
+            </w:r>
+            <w:r>
+              <w:rPr>
+                <w:rFonts w:ascii="Times New Roman" w:hAnsi="Times New Roman"/>
+                <w:b w:val="0"/>
+                <w:sz w:val="18"/>
+              </w:rPr>
+            </w:r>
+          </w:p>
+        </w:tc>
+        <w:tc>
+          <w:tcPr>
+            <w:tcW w:type="dxa" w:w="1077"/>
+            <w:vAlign w:val="center"/>
+          </w:tcPr>
+          <w:p>
+            <w:pPr>
+              <w:jc w:val="center"/>
+            </w:pPr>
+            <w:r>
+              <w:rPr>
+                <w:sz w:val="18"/>
+              </w:rPr>
+            </w:r>
+            <w:r>
+              <w:rPr>
+                <w:rFonts w:ascii="Times New Roman" w:hAnsi="Times New Roman"/>
+                <w:b w:val="0"/>
+                <w:sz w:val="18"/>
+              </w:rPr>
+            </w:r>
+          </w:p>
+        </w:tc>
+        <w:tc>
+          <w:tcPr>
+            <w:tcW w:type="dxa" w:w="1077"/>
+            <w:vAlign w:val="center"/>
+          </w:tcPr>
+          <w:p>
+            <w:pPr>
+              <w:jc w:val="center"/>
+            </w:pPr>
+            <w:r>
+              <w:rPr>
+                <w:sz w:val="18"/>
+              </w:rPr>
+            </w:r>
+            <w:r>
+              <w:rPr>
+                <w:rFonts w:ascii="Times New Roman" w:hAnsi="Times New Roman"/>
+                <w:b w:val="0"/>
+                <w:sz w:val="18"/>
+              </w:rPr>
             </w:r>
           </w:p>
         </w:tc>
@@ -2346,19 +4148,23 @@
       <w:tr>
         <w:tc>
           <w:tcPr>
-            <w:tcW w:type="dxa" w:w="4844"/>
+            <w:tcW w:type="dxa" w:w="1077"/>
             <w:vAlign w:val="center"/>
           </w:tcPr>
           <w:p>
             <w:pPr>
               <w:jc w:val="center"/>
             </w:pPr>
-            <w:r/>
+            <w:r>
+              <w:rPr>
+                <w:sz w:val="18"/>
+              </w:rPr>
+            </w:r>
             <w:r>
               <w:rPr>
                 <w:rFonts w:ascii="Times New Roman" w:hAnsi="Times New Roman"/>
                 <w:b w:val="0"/>
-                <w:sz w:val="22"/>
+                <w:sz w:val="18"/>
               </w:rPr>
               <w:t>Мікроклімат</w:t>
             </w:r>
@@ -2366,21 +4172,187 @@
         </w:tc>
         <w:tc>
           <w:tcPr>
-            <w:tcW w:type="dxa" w:w="4844"/>
+            <w:tcW w:type="dxa" w:w="1077"/>
             <w:vAlign w:val="center"/>
           </w:tcPr>
           <w:p>
             <w:pPr>
               <w:jc w:val="center"/>
             </w:pPr>
-            <w:r/>
+            <w:r>
+              <w:rPr>
+                <w:sz w:val="18"/>
+              </w:rPr>
+            </w:r>
             <w:r>
               <w:rPr>
                 <w:rFonts w:ascii="Times New Roman" w:hAnsi="Times New Roman"/>
                 <w:b w:val="0"/>
-                <w:sz w:val="22"/>
+                <w:sz w:val="18"/>
               </w:rPr>
-              <w:t>2</w:t>
+              <w:t>t=21 °C; v=0,1 м/с; φ=64 %</w:t>
+            </w:r>
+          </w:p>
+        </w:tc>
+        <w:tc>
+          <w:tcPr>
+            <w:tcW w:type="dxa" w:w="1077"/>
+            <w:vAlign w:val="center"/>
+          </w:tcPr>
+          <w:p>
+            <w:pPr>
+              <w:jc w:val="center"/>
+            </w:pPr>
+            <w:r>
+              <w:rPr>
+                <w:sz w:val="18"/>
+              </w:rPr>
+            </w:r>
+            <w:r>
+              <w:rPr>
+                <w:rFonts w:ascii="Times New Roman" w:hAnsi="Times New Roman"/>
+                <w:b w:val="0"/>
+                <w:sz w:val="18"/>
+              </w:rPr>
+            </w:r>
+          </w:p>
+        </w:tc>
+        <w:tc>
+          <w:tcPr>
+            <w:tcW w:type="dxa" w:w="1077"/>
+            <w:vAlign w:val="center"/>
+          </w:tcPr>
+          <w:p>
+            <w:pPr>
+              <w:jc w:val="center"/>
+            </w:pPr>
+            <w:r>
+              <w:rPr>
+                <w:sz w:val="18"/>
+              </w:rPr>
+            </w:r>
+            <w:r>
+              <w:rPr>
+                <w:rFonts w:ascii="Times New Roman" w:hAnsi="Times New Roman"/>
+                <w:b w:val="0"/>
+                <w:sz w:val="18"/>
+              </w:rPr>
+              <w:t>21; 0,1; 64</w:t>
+            </w:r>
+          </w:p>
+        </w:tc>
+        <w:tc>
+          <w:tcPr>
+            <w:tcW w:type="dxa" w:w="1077"/>
+            <w:vAlign w:val="center"/>
+          </w:tcPr>
+          <w:p>
+            <w:pPr>
+              <w:jc w:val="center"/>
+            </w:pPr>
+            <w:r>
+              <w:rPr>
+                <w:sz w:val="18"/>
+              </w:rPr>
+            </w:r>
+            <w:r>
+              <w:rPr>
+                <w:rFonts w:ascii="Times New Roman" w:hAnsi="Times New Roman"/>
+                <w:b w:val="0"/>
+                <w:sz w:val="18"/>
+              </w:rPr>
+            </w:r>
+          </w:p>
+        </w:tc>
+        <w:tc>
+          <w:tcPr>
+            <w:tcW w:type="dxa" w:w="1077"/>
+            <w:vAlign w:val="center"/>
+          </w:tcPr>
+          <w:p>
+            <w:pPr>
+              <w:jc w:val="center"/>
+            </w:pPr>
+            <w:r>
+              <w:rPr>
+                <w:sz w:val="18"/>
+              </w:rPr>
+            </w:r>
+            <w:r>
+              <w:rPr>
+                <w:rFonts w:ascii="Times New Roman" w:hAnsi="Times New Roman"/>
+                <w:b w:val="0"/>
+                <w:sz w:val="18"/>
+              </w:rPr>
+            </w:r>
+          </w:p>
+        </w:tc>
+        <w:tc>
+          <w:tcPr>
+            <w:tcW w:type="dxa" w:w="1077"/>
+            <w:vAlign w:val="center"/>
+          </w:tcPr>
+          <w:p>
+            <w:pPr>
+              <w:jc w:val="center"/>
+            </w:pPr>
+            <w:r>
+              <w:rPr>
+                <w:sz w:val="18"/>
+              </w:rPr>
+            </w:r>
+            <w:r>
+              <w:rPr>
+                <w:rFonts w:ascii="Times New Roman" w:hAnsi="Times New Roman"/>
+                <w:b w:val="0"/>
+                <w:sz w:val="18"/>
+              </w:rPr>
+            </w:r>
+          </w:p>
+        </w:tc>
+        <w:tc>
+          <w:tcPr>
+            <w:tcW w:type="dxa" w:w="1077"/>
+            <w:vAlign w:val="center"/>
+          </w:tcPr>
+          <w:p>
+            <w:pPr>
+              <w:jc w:val="center"/>
+            </w:pPr>
+            <w:r>
+              <w:rPr>
+                <w:sz w:val="18"/>
+              </w:rPr>
+            </w:r>
+            <w:r>
+              <w:rPr>
+                <w:rFonts w:ascii="Times New Roman" w:hAnsi="Times New Roman"/>
+                <w:b w:val="0"/>
+                <w:sz w:val="18"/>
+              </w:rPr>
+            </w:r>
+          </w:p>
+        </w:tc>
+        <w:tc>
+          <w:tcPr>
+            <w:tcW w:type="dxa" w:w="1077"/>
+            <w:vAlign w:val="center"/>
+          </w:tcPr>
+          <w:p>
+            <w:pPr>
+              <w:jc w:val="center"/>
+            </w:pPr>
+            <w:r>
+              <w:rPr>
+                <w:sz w:val="18"/>
+              </w:rPr>
+            </w:r>
+            <w:r>
+              <w:rPr>
+                <w:rFonts w:ascii="Times New Roman" w:hAnsi="Times New Roman"/>
+                <w:b w:val="0"/>
+                <w:sz w:val="18"/>
+              </w:rPr>
             </w:r>
           </w:p>
         </w:tc>
@@ -2388,19 +4360,23 @@
       <w:tr>
         <w:tc>
           <w:tcPr>
-            <w:tcW w:type="dxa" w:w="4844"/>
+            <w:tcW w:type="dxa" w:w="1077"/>
             <w:vAlign w:val="center"/>
           </w:tcPr>
           <w:p>
             <w:pPr>
               <w:jc w:val="center"/>
             </w:pPr>
-            <w:r/>
+            <w:r>
+              <w:rPr>
+                <w:sz w:val="18"/>
+              </w:rPr>
+            </w:r>
             <w:r>
               <w:rPr>
                 <w:rFonts w:ascii="Times New Roman" w:hAnsi="Times New Roman"/>
                 <w:b w:val="0"/>
-                <w:sz w:val="22"/>
+                <w:sz w:val="18"/>
               </w:rPr>
               <w:t>Важкість праці</w:t>
             </w:r>
@@ -2408,21 +4384,187 @@
         </w:tc>
         <w:tc>
           <w:tcPr>
-            <w:tcW w:type="dxa" w:w="4844"/>
+            <w:tcW w:type="dxa" w:w="1077"/>
             <w:vAlign w:val="center"/>
           </w:tcPr>
           <w:p>
             <w:pPr>
               <w:jc w:val="center"/>
             </w:pPr>
-            <w:r/>
+            <w:r>
+              <w:rPr>
+                <w:sz w:val="18"/>
+              </w:rPr>
+            </w:r>
             <w:r>
               <w:rPr>
                 <w:rFonts w:ascii="Times New Roman" w:hAnsi="Times New Roman"/>
                 <w:b w:val="0"/>
-                <w:sz w:val="22"/>
+                <w:sz w:val="18"/>
               </w:rPr>
-              <w:t>3.1</w:t>
+              <w:t>105 нахилів/зміну</w:t>
+            </w:r>
+          </w:p>
+        </w:tc>
+        <w:tc>
+          <w:tcPr>
+            <w:tcW w:type="dxa" w:w="1077"/>
+            <w:vAlign w:val="center"/>
+          </w:tcPr>
+          <w:p>
+            <w:pPr>
+              <w:jc w:val="center"/>
+            </w:pPr>
+            <w:r>
+              <w:rPr>
+                <w:sz w:val="18"/>
+              </w:rPr>
+            </w:r>
+            <w:r>
+              <w:rPr>
+                <w:rFonts w:ascii="Times New Roman" w:hAnsi="Times New Roman"/>
+                <w:b w:val="0"/>
+                <w:sz w:val="18"/>
+              </w:rPr>
+            </w:r>
+          </w:p>
+        </w:tc>
+        <w:tc>
+          <w:tcPr>
+            <w:tcW w:type="dxa" w:w="1077"/>
+            <w:vAlign w:val="center"/>
+          </w:tcPr>
+          <w:p>
+            <w:pPr>
+              <w:jc w:val="center"/>
+            </w:pPr>
+            <w:r>
+              <w:rPr>
+                <w:sz w:val="18"/>
+              </w:rPr>
+            </w:r>
+            <w:r>
+              <w:rPr>
+                <w:rFonts w:ascii="Times New Roman" w:hAnsi="Times New Roman"/>
+                <w:b w:val="0"/>
+                <w:sz w:val="18"/>
+              </w:rPr>
+            </w:r>
+          </w:p>
+        </w:tc>
+        <w:tc>
+          <w:tcPr>
+            <w:tcW w:type="dxa" w:w="1077"/>
+            <w:vAlign w:val="center"/>
+          </w:tcPr>
+          <w:p>
+            <w:pPr>
+              <w:jc w:val="center"/>
+            </w:pPr>
+            <w:r>
+              <w:rPr>
+                <w:sz w:val="18"/>
+              </w:rPr>
+            </w:r>
+            <w:r>
+              <w:rPr>
+                <w:rFonts w:ascii="Times New Roman" w:hAnsi="Times New Roman"/>
+                <w:b w:val="0"/>
+                <w:sz w:val="18"/>
+              </w:rPr>
+              <w:t>105</w:t>
+            </w:r>
+          </w:p>
+        </w:tc>
+        <w:tc>
+          <w:tcPr>
+            <w:tcW w:type="dxa" w:w="1077"/>
+            <w:vAlign w:val="center"/>
+          </w:tcPr>
+          <w:p>
+            <w:pPr>
+              <w:jc w:val="center"/>
+            </w:pPr>
+            <w:r>
+              <w:rPr>
+                <w:sz w:val="18"/>
+              </w:rPr>
+            </w:r>
+            <w:r>
+              <w:rPr>
+                <w:rFonts w:ascii="Times New Roman" w:hAnsi="Times New Roman"/>
+                <w:b w:val="0"/>
+                <w:sz w:val="18"/>
+              </w:rPr>
+            </w:r>
+          </w:p>
+        </w:tc>
+        <w:tc>
+          <w:tcPr>
+            <w:tcW w:type="dxa" w:w="1077"/>
+            <w:vAlign w:val="center"/>
+          </w:tcPr>
+          <w:p>
+            <w:pPr>
+              <w:jc w:val="center"/>
+            </w:pPr>
+            <w:r>
+              <w:rPr>
+                <w:sz w:val="18"/>
+              </w:rPr>
+            </w:r>
+            <w:r>
+              <w:rPr>
+                <w:rFonts w:ascii="Times New Roman" w:hAnsi="Times New Roman"/>
+                <w:b w:val="0"/>
+                <w:sz w:val="18"/>
+              </w:rPr>
+            </w:r>
+          </w:p>
+        </w:tc>
+        <w:tc>
+          <w:tcPr>
+            <w:tcW w:type="dxa" w:w="1077"/>
+            <w:vAlign w:val="center"/>
+          </w:tcPr>
+          <w:p>
+            <w:pPr>
+              <w:jc w:val="center"/>
+            </w:pPr>
+            <w:r>
+              <w:rPr>
+                <w:sz w:val="18"/>
+              </w:rPr>
+            </w:r>
+            <w:r>
+              <w:rPr>
+                <w:rFonts w:ascii="Times New Roman" w:hAnsi="Times New Roman"/>
+                <w:b w:val="0"/>
+                <w:sz w:val="18"/>
+              </w:rPr>
+            </w:r>
+          </w:p>
+        </w:tc>
+        <w:tc>
+          <w:tcPr>
+            <w:tcW w:type="dxa" w:w="1077"/>
+            <w:vAlign w:val="center"/>
+          </w:tcPr>
+          <w:p>
+            <w:pPr>
+              <w:jc w:val="center"/>
+            </w:pPr>
+            <w:r>
+              <w:rPr>
+                <w:sz w:val="18"/>
+              </w:rPr>
+            </w:r>
+            <w:r>
+              <w:rPr>
+                <w:rFonts w:ascii="Times New Roman" w:hAnsi="Times New Roman"/>
+                <w:b w:val="0"/>
+                <w:sz w:val="18"/>
+              </w:rPr>
             </w:r>
           </w:p>
         </w:tc>
@@ -2430,19 +4572,23 @@
       <w:tr>
         <w:tc>
           <w:tcPr>
-            <w:tcW w:type="dxa" w:w="4844"/>
+            <w:tcW w:type="dxa" w:w="1077"/>
             <w:vAlign w:val="center"/>
           </w:tcPr>
           <w:p>
             <w:pPr>
               <w:jc w:val="center"/>
             </w:pPr>
-            <w:r/>
+            <w:r>
+              <w:rPr>
+                <w:sz w:val="18"/>
+              </w:rPr>
+            </w:r>
             <w:r>
               <w:rPr>
                 <w:rFonts w:ascii="Times New Roman" w:hAnsi="Times New Roman"/>
                 <w:b w:val="0"/>
-                <w:sz w:val="22"/>
+                <w:sz w:val="18"/>
               </w:rPr>
               <w:t>Напруженість праці</w:t>
             </w:r>
@@ -2450,21 +4596,187 @@
         </w:tc>
         <w:tc>
           <w:tcPr>
-            <w:tcW w:type="dxa" w:w="4844"/>
+            <w:tcW w:type="dxa" w:w="1077"/>
             <w:vAlign w:val="center"/>
           </w:tcPr>
           <w:p>
             <w:pPr>
               <w:jc w:val="center"/>
             </w:pPr>
-            <w:r/>
+            <w:r>
+              <w:rPr>
+                <w:sz w:val="18"/>
+              </w:rPr>
+            </w:r>
             <w:r>
               <w:rPr>
                 <w:rFonts w:ascii="Times New Roman" w:hAnsi="Times New Roman"/>
                 <w:b w:val="0"/>
-                <w:sz w:val="22"/>
+                <w:sz w:val="18"/>
               </w:rPr>
-              <w:t>3.1</w:t>
+              <w:t>увага 91 %; двозмінна робота</w:t>
+            </w:r>
+          </w:p>
+        </w:tc>
+        <w:tc>
+          <w:tcPr>
+            <w:tcW w:type="dxa" w:w="1077"/>
+            <w:vAlign w:val="center"/>
+          </w:tcPr>
+          <w:p>
+            <w:pPr>
+              <w:jc w:val="center"/>
+            </w:pPr>
+            <w:r>
+              <w:rPr>
+                <w:sz w:val="18"/>
+              </w:rPr>
+            </w:r>
+            <w:r>
+              <w:rPr>
+                <w:rFonts w:ascii="Times New Roman" w:hAnsi="Times New Roman"/>
+                <w:b w:val="0"/>
+                <w:sz w:val="18"/>
+              </w:rPr>
+            </w:r>
+          </w:p>
+        </w:tc>
+        <w:tc>
+          <w:tcPr>
+            <w:tcW w:type="dxa" w:w="1077"/>
+            <w:vAlign w:val="center"/>
+          </w:tcPr>
+          <w:p>
+            <w:pPr>
+              <w:jc w:val="center"/>
+            </w:pPr>
+            <w:r>
+              <w:rPr>
+                <w:sz w:val="18"/>
+              </w:rPr>
+            </w:r>
+            <w:r>
+              <w:rPr>
+                <w:rFonts w:ascii="Times New Roman" w:hAnsi="Times New Roman"/>
+                <w:b w:val="0"/>
+                <w:sz w:val="18"/>
+              </w:rPr>
+            </w:r>
+          </w:p>
+        </w:tc>
+        <w:tc>
+          <w:tcPr>
+            <w:tcW w:type="dxa" w:w="1077"/>
+            <w:vAlign w:val="center"/>
+          </w:tcPr>
+          <w:p>
+            <w:pPr>
+              <w:jc w:val="center"/>
+            </w:pPr>
+            <w:r>
+              <w:rPr>
+                <w:sz w:val="18"/>
+              </w:rPr>
+            </w:r>
+            <w:r>
+              <w:rPr>
+                <w:rFonts w:ascii="Times New Roman" w:hAnsi="Times New Roman"/>
+                <w:b w:val="0"/>
+                <w:sz w:val="18"/>
+              </w:rPr>
+              <w:t>91</w:t>
+            </w:r>
+          </w:p>
+        </w:tc>
+        <w:tc>
+          <w:tcPr>
+            <w:tcW w:type="dxa" w:w="1077"/>
+            <w:vAlign w:val="center"/>
+          </w:tcPr>
+          <w:p>
+            <w:pPr>
+              <w:jc w:val="center"/>
+            </w:pPr>
+            <w:r>
+              <w:rPr>
+                <w:sz w:val="18"/>
+              </w:rPr>
+            </w:r>
+            <w:r>
+              <w:rPr>
+                <w:rFonts w:ascii="Times New Roman" w:hAnsi="Times New Roman"/>
+                <w:b w:val="0"/>
+                <w:sz w:val="18"/>
+              </w:rPr>
+            </w:r>
+          </w:p>
+        </w:tc>
+        <w:tc>
+          <w:tcPr>
+            <w:tcW w:type="dxa" w:w="1077"/>
+            <w:vAlign w:val="center"/>
+          </w:tcPr>
+          <w:p>
+            <w:pPr>
+              <w:jc w:val="center"/>
+            </w:pPr>
+            <w:r>
+              <w:rPr>
+                <w:sz w:val="18"/>
+              </w:rPr>
+            </w:r>
+            <w:r>
+              <w:rPr>
+                <w:rFonts w:ascii="Times New Roman" w:hAnsi="Times New Roman"/>
+                <w:b w:val="0"/>
+                <w:sz w:val="18"/>
+              </w:rPr>
+            </w:r>
+          </w:p>
+        </w:tc>
+        <w:tc>
+          <w:tcPr>
+            <w:tcW w:type="dxa" w:w="1077"/>
+            <w:vAlign w:val="center"/>
+          </w:tcPr>
+          <w:p>
+            <w:pPr>
+              <w:jc w:val="center"/>
+            </w:pPr>
+            <w:r>
+              <w:rPr>
+                <w:sz w:val="18"/>
+              </w:rPr>
+            </w:r>
+            <w:r>
+              <w:rPr>
+                <w:rFonts w:ascii="Times New Roman" w:hAnsi="Times New Roman"/>
+                <w:b w:val="0"/>
+                <w:sz w:val="18"/>
+              </w:rPr>
+            </w:r>
+          </w:p>
+        </w:tc>
+        <w:tc>
+          <w:tcPr>
+            <w:tcW w:type="dxa" w:w="1077"/>
+            <w:vAlign w:val="center"/>
+          </w:tcPr>
+          <w:p>
+            <w:pPr>
+              <w:jc w:val="center"/>
+            </w:pPr>
+            <w:r>
+              <w:rPr>
+                <w:sz w:val="18"/>
+              </w:rPr>
+            </w:r>
+            <w:r>
+              <w:rPr>
+                <w:rFonts w:ascii="Times New Roman" w:hAnsi="Times New Roman"/>
+                <w:b w:val="0"/>
+                <w:sz w:val="18"/>
+              </w:rPr>
             </w:r>
           </w:p>
         </w:tc>
@@ -2472,19 +4784,23 @@
       <w:tr>
         <w:tc>
           <w:tcPr>
-            <w:tcW w:type="dxa" w:w="4844"/>
+            <w:tcW w:type="dxa" w:w="1077"/>
             <w:vAlign w:val="center"/>
           </w:tcPr>
           <w:p>
             <w:pPr>
               <w:jc w:val="center"/>
             </w:pPr>
-            <w:r/>
+            <w:r>
+              <w:rPr>
+                <w:sz w:val="18"/>
+              </w:rPr>
+            </w:r>
             <w:r>
               <w:rPr>
                 <w:rFonts w:ascii="Times New Roman" w:hAnsi="Times New Roman"/>
                 <w:b w:val="0"/>
-                <w:sz w:val="22"/>
+                <w:sz w:val="18"/>
               </w:rPr>
               <w:t>Загальна оцінка умов праці</w:t>
             </w:r>
@@ -2492,21 +4808,187 @@
         </w:tc>
         <w:tc>
           <w:tcPr>
-            <w:tcW w:type="dxa" w:w="4844"/>
+            <w:tcW w:type="dxa" w:w="1077"/>
             <w:vAlign w:val="center"/>
           </w:tcPr>
           <w:p>
             <w:pPr>
               <w:jc w:val="center"/>
             </w:pPr>
-            <w:r/>
+            <w:r>
+              <w:rPr>
+                <w:sz w:val="18"/>
+              </w:rPr>
+            </w:r>
             <w:r>
               <w:rPr>
                 <w:rFonts w:ascii="Times New Roman" w:hAnsi="Times New Roman"/>
                 <w:b w:val="0"/>
-                <w:sz w:val="22"/>
+                <w:sz w:val="18"/>
               </w:rPr>
-              <w:t>3.2</w:t>
+              <w:t>визначальний фактор: шум 87 дБА</w:t>
+            </w:r>
+          </w:p>
+        </w:tc>
+        <w:tc>
+          <w:tcPr>
+            <w:tcW w:type="dxa" w:w="1077"/>
+            <w:vAlign w:val="center"/>
+          </w:tcPr>
+          <w:p>
+            <w:pPr>
+              <w:jc w:val="center"/>
+            </w:pPr>
+            <w:r>
+              <w:rPr>
+                <w:sz w:val="18"/>
+              </w:rPr>
+            </w:r>
+            <w:r>
+              <w:rPr>
+                <w:rFonts w:ascii="Times New Roman" w:hAnsi="Times New Roman"/>
+                <w:b w:val="0"/>
+                <w:sz w:val="18"/>
+              </w:rPr>
+            </w:r>
+          </w:p>
+        </w:tc>
+        <w:tc>
+          <w:tcPr>
+            <w:tcW w:type="dxa" w:w="1077"/>
+            <w:vAlign w:val="center"/>
+          </w:tcPr>
+          <w:p>
+            <w:pPr>
+              <w:jc w:val="center"/>
+            </w:pPr>
+            <w:r>
+              <w:rPr>
+                <w:sz w:val="18"/>
+              </w:rPr>
+            </w:r>
+            <w:r>
+              <w:rPr>
+                <w:rFonts w:ascii="Times New Roman" w:hAnsi="Times New Roman"/>
+                <w:b w:val="0"/>
+                <w:sz w:val="18"/>
+              </w:rPr>
+            </w:r>
+          </w:p>
+        </w:tc>
+        <w:tc>
+          <w:tcPr>
+            <w:tcW w:type="dxa" w:w="1077"/>
+            <w:vAlign w:val="center"/>
+          </w:tcPr>
+          <w:p>
+            <w:pPr>
+              <w:jc w:val="center"/>
+            </w:pPr>
+            <w:r>
+              <w:rPr>
+                <w:sz w:val="18"/>
+              </w:rPr>
+            </w:r>
+            <w:r>
+              <w:rPr>
+                <w:rFonts w:ascii="Times New Roman" w:hAnsi="Times New Roman"/>
+                <w:b w:val="0"/>
+                <w:sz w:val="18"/>
+              </w:rPr>
+            </w:r>
+          </w:p>
+        </w:tc>
+        <w:tc>
+          <w:tcPr>
+            <w:tcW w:type="dxa" w:w="1077"/>
+            <w:vAlign w:val="center"/>
+          </w:tcPr>
+          <w:p>
+            <w:pPr>
+              <w:jc w:val="center"/>
+            </w:pPr>
+            <w:r>
+              <w:rPr>
+                <w:sz w:val="18"/>
+              </w:rPr>
+            </w:r>
+            <w:r>
+              <w:rPr>
+                <w:rFonts w:ascii="Times New Roman" w:hAnsi="Times New Roman"/>
+                <w:b w:val="0"/>
+                <w:sz w:val="18"/>
+              </w:rPr>
+              <w:t>87 дБА</w:t>
+            </w:r>
+          </w:p>
+        </w:tc>
+        <w:tc>
+          <w:tcPr>
+            <w:tcW w:type="dxa" w:w="1077"/>
+            <w:vAlign w:val="center"/>
+          </w:tcPr>
+          <w:p>
+            <w:pPr>
+              <w:jc w:val="center"/>
+            </w:pPr>
+            <w:r>
+              <w:rPr>
+                <w:sz w:val="18"/>
+              </w:rPr>
+            </w:r>
+            <w:r>
+              <w:rPr>
+                <w:rFonts w:ascii="Times New Roman" w:hAnsi="Times New Roman"/>
+                <w:b w:val="0"/>
+                <w:sz w:val="18"/>
+              </w:rPr>
+            </w:r>
+          </w:p>
+        </w:tc>
+        <w:tc>
+          <w:tcPr>
+            <w:tcW w:type="dxa" w:w="1077"/>
+            <w:vAlign w:val="center"/>
+          </w:tcPr>
+          <w:p>
+            <w:pPr>
+              <w:jc w:val="center"/>
+            </w:pPr>
+            <w:r>
+              <w:rPr>
+                <w:sz w:val="18"/>
+              </w:rPr>
+            </w:r>
+            <w:r>
+              <w:rPr>
+                <w:rFonts w:ascii="Times New Roman" w:hAnsi="Times New Roman"/>
+                <w:b w:val="0"/>
+                <w:sz w:val="18"/>
+              </w:rPr>
+            </w:r>
+          </w:p>
+        </w:tc>
+        <w:tc>
+          <w:tcPr>
+            <w:tcW w:type="dxa" w:w="1077"/>
+            <w:vAlign w:val="center"/>
+          </w:tcPr>
+          <w:p>
+            <w:pPr>
+              <w:jc w:val="center"/>
+            </w:pPr>
+            <w:r>
+              <w:rPr>
+                <w:sz w:val="18"/>
+              </w:rPr>
+            </w:r>
+            <w:r>
+              <w:rPr>
+                <w:rFonts w:ascii="Times New Roman" w:hAnsi="Times New Roman"/>
+                <w:b w:val="0"/>
+                <w:sz w:val="18"/>
+              </w:rPr>
             </w:r>
           </w:p>
         </w:tc>

</xml_diff>